<commit_message>
Drop internal plan step numbering from all titles and docstrings
"Step 3", "3a/3b/3c" and "third bullet" were our own planning labels and mean
nothing to a reader. Worse, the README said "replicating step 3 of Kim et al.",
which attributed our numbering to the paper -- the paper has no such step.

Titles now describe what each thing does: "Extracting and steering a
consciousness direction in Llama-3-8B", "Direction extraction", "Steering and
coefficient selection".

Co-Authored-By: Claude Opus 5 <noreply@anthropic.com>
</commit_message>
<xml_diff>
--- a/RESULTS.docx
+++ b/RESULTS.docx
@@ -12,7 +12,7 @@
           <w:b/>
           <w:sz w:val="30"/>
         </w:rPr>
-        <w:t>Consciousness-direction replication — Step 3 results</w:t>
+        <w:t>Extracting and steering a consciousness direction in Llama-3-8B</w:t>
       </w:r>
     </w:p>
     <w:p>
@@ -1262,7 +1262,7 @@
           <w:color w:val="1F3864"/>
           <w:sz w:val="22"/>
         </w:rPr>
-        <w:t>Extraction (3b)</w:t>
+        <w:t>Direction extraction</w:t>
       </w:r>
     </w:p>
     <w:p>
@@ -1808,7 +1808,7 @@
           <w:color w:val="1F3864"/>
           <w:sz w:val="22"/>
         </w:rPr>
-        <w:t>Steering (3c)</w:t>
+        <w:t>Steering and coefficient selection</w:t>
       </w:r>
     </w:p>
     <w:p>

</xml_diff>